<commit_message>
feat(pdf): T-CIERRE-FINAL-20260929 Hoja 1 + genericidad + fix motor C_Formulas + handoff
Plantilla v2 con densidad vertical de portada corregida (nuevo template Carbone
31f3bfab), genericidad verificada (gates VP-2026-0067), fix C_Formulas aplicado
(v3.3/v2.0 + 2 filas CBR, AT03 OFF), PDF v3 + bateria 127/128 + auditor ciego
APTO, handoff a produccion.

Refs: CI-057, T-CIERRE-FINAL-20260929

Co-Authored-By: Claude Fable 5 <noreply@anthropic.com>
</commit_message>
<xml_diff>
--- a/docs/_artefactos/carbone/PLANTILLA_MET_v2.docx
+++ b/docs/_artefactos/carbone/PLANTILLA_MET_v2.docx
@@ -43,7 +43,7 @@
     </w:tbl>
     <w:p>
       <w:pPr>
-        <w:spacing w:after="120" w:before="0"/>
+        <w:spacing w:after="420" w:before="0"/>
         <w:jc w:val="both"/>
       </w:pPr>
       <w:r>
@@ -56,7 +56,7 @@
     </w:p>
     <w:p>
       <w:pPr>
-        <w:spacing w:after="120" w:before="0"/>
+        <w:spacing w:after="420" w:before="0"/>
         <w:jc w:val="both"/>
       </w:pPr>
       <w:r>
@@ -69,7 +69,7 @@
     </w:p>
     <w:p>
       <w:pPr>
-        <w:spacing w:after="120" w:before="0"/>
+        <w:spacing w:after="420" w:before="0"/>
         <w:jc w:val="both"/>
       </w:pPr>
       <w:r>
@@ -82,7 +82,7 @@
     </w:p>
     <w:p>
       <w:pPr>
-        <w:spacing w:after="120" w:before="0"/>
+        <w:spacing w:after="420" w:before="0"/>
         <w:jc w:val="both"/>
       </w:pPr>
       <w:r>
@@ -134,7 +134,7 @@
     </w:p>
     <w:p>
       <w:pPr>
-        <w:spacing w:after="120" w:before="0"/>
+        <w:spacing w:after="420" w:before="0"/>
         <w:jc w:val="both"/>
       </w:pPr>
       <w:r>
@@ -147,7 +147,7 @@
     </w:p>
     <w:p>
       <w:pPr>
-        <w:spacing w:after="120" w:before="0"/>
+        <w:spacing w:after="420" w:before="0"/>
         <w:jc w:val="both"/>
       </w:pPr>
       <w:r>
@@ -160,7 +160,7 @@
     </w:p>
     <w:p>
       <w:pPr>
-        <w:spacing w:after="120" w:before="0"/>
+        <w:spacing w:after="420" w:before="0"/>
         <w:jc w:val="both"/>
       </w:pPr>
       <w:r>
@@ -212,7 +212,7 @@
     </w:tbl>
     <w:p>
       <w:pPr>
-        <w:spacing w:after="40" w:before="0"/>
+        <w:spacing w:after="400" w:before="0"/>
         <w:jc w:val="both"/>
       </w:pPr>
       <w:r>
@@ -496,46 +496,7 @@
     </w:tbl>
     <w:p>
       <w:pPr>
-        <w:spacing w:after="120" w:before="0"/>
-        <w:jc w:val="both"/>
-      </w:pPr>
-      <w:r>
-        <w:rPr>
-          <w:rFonts w:ascii="Calibri" w:hAnsi="Calibri"/>
-          <w:b w:val="0"/>
-          <w:sz w:val="22"/>
-        </w:rPr>
-      </w:r>
-    </w:p>
-    <w:p>
-      <w:pPr>
-        <w:spacing w:after="120" w:before="0"/>
-        <w:jc w:val="both"/>
-      </w:pPr>
-      <w:r>
-        <w:rPr>
-          <w:rFonts w:ascii="Calibri" w:hAnsi="Calibri"/>
-          <w:b w:val="0"/>
-          <w:sz w:val="22"/>
-        </w:rPr>
-      </w:r>
-    </w:p>
-    <w:p>
-      <w:pPr>
-        <w:spacing w:after="120" w:before="0"/>
-        <w:jc w:val="both"/>
-      </w:pPr>
-      <w:r>
-        <w:rPr>
-          <w:rFonts w:ascii="Calibri" w:hAnsi="Calibri"/>
-          <w:b w:val="0"/>
-          <w:sz w:val="22"/>
-        </w:rPr>
-      </w:r>
-    </w:p>
-    <w:p>
-      <w:pPr>
-        <w:spacing w:after="120" w:before="0"/>
+        <w:spacing w:after="240" w:before="0"/>
         <w:jc w:val="both"/>
       </w:pPr>
       <w:r>
@@ -640,7 +601,7 @@
       <w:pPr>
         <w:sectPr>
           <w:pgSz w:w="11906" w:h="16838"/>
-          <w:pgMar w:top="567" w:right="567" w:bottom="567" w:left="567" w:header="720" w:footer="720" w:gutter="0"/>
+          <w:pgMar w:top="1060" w:right="567" w:bottom="567" w:left="567" w:header="720" w:footer="720" w:gutter="0"/>
           <w:cols w:space="720"/>
           <w:docGrid w:linePitch="360"/>
         </w:sectPr>

</xml_diff>